<commit_message>
Record the test run at the released tree and repair two pack defects
The 19 worker tests pass at this tree as they did on 19 October. The code
under src/main and src/test and the pom are unchanged since dbc0a33, so the
count was expected to hold; it is now recorded at the release commit with the
toolchain that ran it.

Two defects in the pack are fixed. The closing slide still linked the written
evaluation as Markdown, which no longer exists now that the pack carries only
Word and PDF; it points at the PDF. The 29 September contribution matrix was
present but absent from the index, so it now has a dated entry of its own,
described as a snapshot from that date and superseded by the contribution
record. That is the honest way to keep it: the matrix records the acceptance
plan as led by Ruby while the backlog records PB-14 and PB-18 as first owned by
Ryan, and a dated snapshot does not have to agree with the current position.
</commit_message>
<xml_diff>
--- a/submissions/Submission_Index.docx
+++ b/submissions/Submission_Index.docx
@@ -6,7 +6,7 @@
       <w:pPr>
         <w:pStyle w:val="Heading1"/>
       </w:pPr>
-      <w:bookmarkStart w:id="18" w:name="_99b6279239ed84a804739a04c8df791dda83077"/>
+      <w:bookmarkStart w:id="18" w:name="_a5a9cd96df41a274f9573a7cf4375fd62db01b5"/>
       <w:r>
         <w:t xml:space="preserve">Submission Index — second release</w:t>
       </w:r>
@@ -478,8 +478,8 @@
         <w:tc>
           <w:tcPr>
             <w:tcW w:type="dxa" w:w="2058"/>
-            <w:tcW w:type="dxa" w:w="2058"/>
-          </w:tcPr>
+          </w:tcPr>
+          <w:tcPr/>
           <w:p>
             <w:pPr>
               <w:pStyle w:val="Compact"/>
@@ -496,8 +496,8 @@
         <w:tc>
           <w:tcPr>
             <w:tcW w:type="dxa" w:w="1409"/>
-            <w:tcW w:type="dxa" w:w="1409"/>
-          </w:tcPr>
+          </w:tcPr>
+          <w:tcPr/>
           <w:p>
             <w:pPr>
               <w:pStyle w:val="Compact"/>
@@ -514,8 +514,8 @@
         <w:tc>
           <w:tcPr>
             <w:tcW w:type="dxa" w:w="1235"/>
-            <w:tcW w:type="dxa" w:w="1235"/>
-          </w:tcPr>
+          </w:tcPr>
+          <w:tcPr/>
           <w:p>
             <w:pPr>
               <w:pStyle w:val="Compact"/>
@@ -532,8 +532,8 @@
         <w:tc>
           <w:tcPr>
             <w:tcW w:type="dxa" w:w="5164"/>
-            <w:tcW w:type="dxa" w:w="5164"/>
-          </w:tcPr>
+          </w:tcPr>
+          <w:tcPr/>
           <w:p>
             <w:pPr>
               <w:pStyle w:val="Compact"/>
@@ -555,8 +555,8 @@
         <w:tc>
           <w:tcPr>
             <w:tcW w:type="dxa" w:w="2058"/>
-            <w:tcW w:type="dxa" w:w="2058"/>
-          </w:tcPr>
+          </w:tcPr>
+          <w:tcPr/>
           <w:p>
             <w:pPr>
               <w:pStyle w:val="Compact"/>
@@ -574,8 +574,8 @@
         <w:tc>
           <w:tcPr>
             <w:tcW w:type="dxa" w:w="1409"/>
-            <w:tcW w:type="dxa" w:w="1409"/>
-          </w:tcPr>
+          </w:tcPr>
+          <w:tcPr/>
           <w:p>
             <w:pPr>
               <w:pStyle w:val="Compact"/>
@@ -593,8 +593,8 @@
         <w:tc>
           <w:tcPr>
             <w:tcW w:type="dxa" w:w="1235"/>
-            <w:tcW w:type="dxa" w:w="1235"/>
-          </w:tcPr>
+          </w:tcPr>
+          <w:tcPr/>
           <w:p>
             <w:pPr>
               <w:pStyle w:val="Compact"/>
@@ -611,8 +611,8 @@
         <w:tc>
           <w:tcPr>
             <w:tcW w:type="dxa" w:w="5164"/>
-            <w:tcW w:type="dxa" w:w="5164"/>
-          </w:tcPr>
+          </w:tcPr>
+          <w:tcPr/>
           <w:p>
             <w:pPr>
               <w:pStyle w:val="Compact"/>
@@ -694,8 +694,8 @@
         <w:tc>
           <w:tcPr>
             <w:tcW w:type="dxa" w:w="2058"/>
-            <w:tcW w:type="dxa" w:w="2058"/>
-          </w:tcPr>
+          </w:tcPr>
+          <w:tcPr/>
           <w:p>
             <w:pPr>
               <w:pStyle w:val="Compact"/>
@@ -713,8 +713,8 @@
         <w:tc>
           <w:tcPr>
             <w:tcW w:type="dxa" w:w="1409"/>
-            <w:tcW w:type="dxa" w:w="1409"/>
-          </w:tcPr>
+          </w:tcPr>
+          <w:tcPr/>
           <w:p>
             <w:pPr>
               <w:pStyle w:val="Compact"/>
@@ -731,8 +731,8 @@
         <w:tc>
           <w:tcPr>
             <w:tcW w:type="dxa" w:w="1235"/>
-            <w:tcW w:type="dxa" w:w="1235"/>
-          </w:tcPr>
+          </w:tcPr>
+          <w:tcPr/>
           <w:p>
             <w:pPr>
               <w:pStyle w:val="Compact"/>
@@ -749,8 +749,8 @@
         <w:tc>
           <w:tcPr>
             <w:tcW w:type="dxa" w:w="5164"/>
-            <w:tcW w:type="dxa" w:w="5164"/>
-          </w:tcPr>
+          </w:tcPr>
+          <w:tcPr/>
           <w:p>
             <w:pPr>
               <w:pStyle w:val="Compact"/>
@@ -889,8 +889,8 @@
         <w:tc>
           <w:tcPr>
             <w:tcW w:type="dxa" w:w="587"/>
-            <w:tcW w:type="dxa" w:w="587"/>
-          </w:tcPr>
+          </w:tcPr>
+          <w:tcPr/>
           <w:p>
             <w:pPr>
               <w:pStyle w:val="Compact"/>
@@ -907,8 +907,8 @@
         <w:tc>
           <w:tcPr>
             <w:tcW w:type="dxa" w:w="2412"/>
-            <w:tcW w:type="dxa" w:w="2412"/>
-          </w:tcPr>
+          </w:tcPr>
+          <w:tcPr/>
           <w:p>
             <w:pPr>
               <w:pStyle w:val="Compact"/>
@@ -925,8 +925,8 @@
         <w:tc>
           <w:tcPr>
             <w:tcW w:type="dxa" w:w="3933"/>
-            <w:tcW w:type="dxa" w:w="3933"/>
-          </w:tcPr>
+          </w:tcPr>
+          <w:tcPr/>
           <w:p>
             <w:pPr>
               <w:pStyle w:val="Compact"/>
@@ -943,8 +943,8 @@
         <w:tc>
           <w:tcPr>
             <w:tcW w:type="dxa" w:w="2934"/>
-            <w:tcW w:type="dxa" w:w="2934"/>
-          </w:tcPr>
+          </w:tcPr>
+          <w:tcPr/>
           <w:p>
             <w:pPr>
               <w:pStyle w:val="Compact"/>
@@ -966,8 +966,8 @@
         <w:tc>
           <w:tcPr>
             <w:tcW w:type="dxa" w:w="587"/>
-            <w:tcW w:type="dxa" w:w="587"/>
-          </w:tcPr>
+          </w:tcPr>
+          <w:tcPr/>
           <w:p>
             <w:pPr>
               <w:pStyle w:val="Compact"/>
@@ -985,8 +985,8 @@
         <w:tc>
           <w:tcPr>
             <w:tcW w:type="dxa" w:w="2412"/>
-            <w:tcW w:type="dxa" w:w="2412"/>
-          </w:tcPr>
+          </w:tcPr>
+          <w:tcPr/>
           <w:p>
             <w:pPr>
               <w:pStyle w:val="Compact"/>
@@ -1003,8 +1003,8 @@
         <w:tc>
           <w:tcPr>
             <w:tcW w:type="dxa" w:w="3933"/>
-            <w:tcW w:type="dxa" w:w="3933"/>
-          </w:tcPr>
+          </w:tcPr>
+          <w:tcPr/>
           <w:p>
             <w:pPr>
               <w:pStyle w:val="Compact"/>
@@ -1051,8 +1051,8 @@
         <w:tc>
           <w:tcPr>
             <w:tcW w:type="dxa" w:w="2934"/>
-            <w:tcW w:type="dxa" w:w="2934"/>
-          </w:tcPr>
+          </w:tcPr>
+          <w:tcPr/>
           <w:p>
             <w:pPr>
               <w:pStyle w:val="Compact"/>
@@ -1089,8 +1089,8 @@
         <w:tc>
           <w:tcPr>
             <w:tcW w:type="dxa" w:w="587"/>
-            <w:tcW w:type="dxa" w:w="587"/>
-          </w:tcPr>
+          </w:tcPr>
+          <w:tcPr/>
           <w:p>
             <w:pPr>
               <w:pStyle w:val="Compact"/>
@@ -1108,8 +1108,8 @@
         <w:tc>
           <w:tcPr>
             <w:tcW w:type="dxa" w:w="2412"/>
-            <w:tcW w:type="dxa" w:w="2412"/>
-          </w:tcPr>
+          </w:tcPr>
+          <w:tcPr/>
           <w:p>
             <w:pPr>
               <w:pStyle w:val="Compact"/>
@@ -1126,8 +1126,8 @@
         <w:tc>
           <w:tcPr>
             <w:tcW w:type="dxa" w:w="3933"/>
-            <w:tcW w:type="dxa" w:w="3933"/>
-          </w:tcPr>
+          </w:tcPr>
+          <w:tcPr/>
           <w:p>
             <w:pPr>
               <w:pStyle w:val="Compact"/>
@@ -1174,8 +1174,8 @@
         <w:tc>
           <w:tcPr>
             <w:tcW w:type="dxa" w:w="2934"/>
-            <w:tcW w:type="dxa" w:w="2934"/>
-          </w:tcPr>
+          </w:tcPr>
+          <w:tcPr/>
           <w:p>
             <w:pPr>
               <w:pStyle w:val="Compact"/>
@@ -1197,8 +1197,8 @@
         <w:tc>
           <w:tcPr>
             <w:tcW w:type="dxa" w:w="587"/>
-            <w:tcW w:type="dxa" w:w="587"/>
-          </w:tcPr>
+          </w:tcPr>
+          <w:tcPr/>
           <w:p>
             <w:pPr>
               <w:pStyle w:val="Compact"/>
@@ -1216,8 +1216,8 @@
         <w:tc>
           <w:tcPr>
             <w:tcW w:type="dxa" w:w="2412"/>
-            <w:tcW w:type="dxa" w:w="2412"/>
-          </w:tcPr>
+          </w:tcPr>
+          <w:tcPr/>
           <w:p>
             <w:pPr>
               <w:pStyle w:val="Compact"/>
@@ -1234,8 +1234,8 @@
         <w:tc>
           <w:tcPr>
             <w:tcW w:type="dxa" w:w="3933"/>
-            <w:tcW w:type="dxa" w:w="3933"/>
-          </w:tcPr>
+          </w:tcPr>
+          <w:tcPr/>
           <w:p>
             <w:pPr>
               <w:pStyle w:val="Compact"/>
@@ -1282,8 +1282,8 @@
         <w:tc>
           <w:tcPr>
             <w:tcW w:type="dxa" w:w="2934"/>
-            <w:tcW w:type="dxa" w:w="2934"/>
-          </w:tcPr>
+          </w:tcPr>
+          <w:tcPr/>
           <w:p>
             <w:pPr>
               <w:pStyle w:val="Compact"/>
@@ -1334,8 +1334,8 @@
         <w:tc>
           <w:tcPr>
             <w:tcW w:type="dxa" w:w="587"/>
-            <w:tcW w:type="dxa" w:w="587"/>
-          </w:tcPr>
+          </w:tcPr>
+          <w:tcPr/>
           <w:p>
             <w:pPr>
               <w:pStyle w:val="Compact"/>
@@ -1353,8 +1353,8 @@
         <w:tc>
           <w:tcPr>
             <w:tcW w:type="dxa" w:w="2412"/>
-            <w:tcW w:type="dxa" w:w="2412"/>
-          </w:tcPr>
+          </w:tcPr>
+          <w:tcPr/>
           <w:p>
             <w:pPr>
               <w:pStyle w:val="Compact"/>
@@ -1371,8 +1371,8 @@
         <w:tc>
           <w:tcPr>
             <w:tcW w:type="dxa" w:w="3933"/>
-            <w:tcW w:type="dxa" w:w="3933"/>
-          </w:tcPr>
+          </w:tcPr>
+          <w:tcPr/>
           <w:p>
             <w:pPr>
               <w:pStyle w:val="Compact"/>
@@ -1419,8 +1419,8 @@
         <w:tc>
           <w:tcPr>
             <w:tcW w:type="dxa" w:w="2934"/>
-            <w:tcW w:type="dxa" w:w="2934"/>
-          </w:tcPr>
+          </w:tcPr>
+          <w:tcPr/>
           <w:p>
             <w:pPr>
               <w:pStyle w:val="Compact"/>
@@ -1565,8 +1565,8 @@
         <w:tc>
           <w:tcPr>
             <w:tcW w:type="dxa" w:w="587"/>
-            <w:tcW w:type="dxa" w:w="587"/>
-          </w:tcPr>
+          </w:tcPr>
+          <w:tcPr/>
           <w:p>
             <w:pPr>
               <w:pStyle w:val="Compact"/>
@@ -1583,8 +1583,8 @@
         <w:tc>
           <w:tcPr>
             <w:tcW w:type="dxa" w:w="2412"/>
-            <w:tcW w:type="dxa" w:w="2412"/>
-          </w:tcPr>
+          </w:tcPr>
+          <w:tcPr/>
           <w:p>
             <w:pPr>
               <w:pStyle w:val="Compact"/>
@@ -1601,8 +1601,8 @@
         <w:tc>
           <w:tcPr>
             <w:tcW w:type="dxa" w:w="3933"/>
-            <w:tcW w:type="dxa" w:w="3933"/>
-          </w:tcPr>
+          </w:tcPr>
+          <w:tcPr/>
           <w:p>
             <w:pPr>
               <w:pStyle w:val="Compact"/>
@@ -1619,8 +1619,8 @@
         <w:tc>
           <w:tcPr>
             <w:tcW w:type="dxa" w:w="2934"/>
-            <w:tcW w:type="dxa" w:w="2934"/>
-          </w:tcPr>
+          </w:tcPr>
+          <w:tcPr/>
           <w:p>
             <w:pPr>
               <w:pStyle w:val="Compact"/>
@@ -1642,8 +1642,8 @@
         <w:tc>
           <w:tcPr>
             <w:tcW w:type="dxa" w:w="587"/>
-            <w:tcW w:type="dxa" w:w="587"/>
-          </w:tcPr>
+          </w:tcPr>
+          <w:tcPr/>
           <w:p>
             <w:pPr>
               <w:pStyle w:val="Compact"/>
@@ -1661,8 +1661,8 @@
         <w:tc>
           <w:tcPr>
             <w:tcW w:type="dxa" w:w="2412"/>
-            <w:tcW w:type="dxa" w:w="2412"/>
-          </w:tcPr>
+          </w:tcPr>
+          <w:tcPr/>
           <w:p>
             <w:pPr>
               <w:pStyle w:val="Compact"/>
@@ -1679,8 +1679,8 @@
         <w:tc>
           <w:tcPr>
             <w:tcW w:type="dxa" w:w="3933"/>
-            <w:tcW w:type="dxa" w:w="3933"/>
-          </w:tcPr>
+          </w:tcPr>
+          <w:tcPr/>
           <w:p>
             <w:pPr>
               <w:pStyle w:val="Compact"/>
@@ -1742,8 +1742,8 @@
         <w:tc>
           <w:tcPr>
             <w:tcW w:type="dxa" w:w="2934"/>
-            <w:tcW w:type="dxa" w:w="2934"/>
-          </w:tcPr>
+          </w:tcPr>
+          <w:tcPr/>
           <w:p>
             <w:pPr>
               <w:pStyle w:val="Compact"/>
@@ -1780,8 +1780,8 @@
         <w:tc>
           <w:tcPr>
             <w:tcW w:type="dxa" w:w="587"/>
-            <w:tcW w:type="dxa" w:w="587"/>
-          </w:tcPr>
+          </w:tcPr>
+          <w:tcPr/>
           <w:p>
             <w:pPr>
               <w:pStyle w:val="Compact"/>
@@ -1799,8 +1799,8 @@
         <w:tc>
           <w:tcPr>
             <w:tcW w:type="dxa" w:w="2412"/>
-            <w:tcW w:type="dxa" w:w="2412"/>
-          </w:tcPr>
+          </w:tcPr>
+          <w:tcPr/>
           <w:p>
             <w:pPr>
               <w:pStyle w:val="Compact"/>
@@ -1817,8 +1817,8 @@
         <w:tc>
           <w:tcPr>
             <w:tcW w:type="dxa" w:w="3933"/>
-            <w:tcW w:type="dxa" w:w="3933"/>
-          </w:tcPr>
+          </w:tcPr>
+          <w:tcPr/>
           <w:p>
             <w:pPr>
               <w:pStyle w:val="Compact"/>
@@ -1998,8 +1998,8 @@
         <w:tc>
           <w:tcPr>
             <w:tcW w:type="dxa" w:w="2934"/>
-            <w:tcW w:type="dxa" w:w="2934"/>
-          </w:tcPr>
+          </w:tcPr>
+          <w:tcPr/>
           <w:p>
             <w:pPr>
               <w:pStyle w:val="Compact"/>
@@ -2102,8 +2102,8 @@
         <w:tc>
           <w:tcPr>
             <w:tcW w:type="dxa" w:w="587"/>
-            <w:tcW w:type="dxa" w:w="587"/>
-          </w:tcPr>
+          </w:tcPr>
+          <w:tcPr/>
           <w:p>
             <w:pPr>
               <w:pStyle w:val="Compact"/>
@@ -2121,8 +2121,8 @@
         <w:tc>
           <w:tcPr>
             <w:tcW w:type="dxa" w:w="2412"/>
-            <w:tcW w:type="dxa" w:w="2412"/>
-          </w:tcPr>
+          </w:tcPr>
+          <w:tcPr/>
           <w:p>
             <w:pPr>
               <w:pStyle w:val="Compact"/>
@@ -2139,8 +2139,8 @@
         <w:tc>
           <w:tcPr>
             <w:tcW w:type="dxa" w:w="3933"/>
-            <w:tcW w:type="dxa" w:w="3933"/>
-          </w:tcPr>
+          </w:tcPr>
+          <w:tcPr/>
           <w:p>
             <w:pPr>
               <w:pStyle w:val="Compact"/>
@@ -2187,8 +2187,8 @@
         <w:tc>
           <w:tcPr>
             <w:tcW w:type="dxa" w:w="2934"/>
-            <w:tcW w:type="dxa" w:w="2934"/>
-          </w:tcPr>
+          </w:tcPr>
+          <w:tcPr/>
           <w:p>
             <w:pPr>
               <w:pStyle w:val="Compact"/>
@@ -2225,8 +2225,8 @@
         <w:tc>
           <w:tcPr>
             <w:tcW w:type="dxa" w:w="587"/>
-            <w:tcW w:type="dxa" w:w="587"/>
-          </w:tcPr>
+          </w:tcPr>
+          <w:tcPr/>
           <w:p>
             <w:pPr>
               <w:pStyle w:val="Compact"/>
@@ -2244,8 +2244,8 @@
         <w:tc>
           <w:tcPr>
             <w:tcW w:type="dxa" w:w="2412"/>
-            <w:tcW w:type="dxa" w:w="2412"/>
-          </w:tcPr>
+          </w:tcPr>
+          <w:tcPr/>
           <w:p>
             <w:pPr>
               <w:pStyle w:val="Compact"/>
@@ -2262,8 +2262,8 @@
         <w:tc>
           <w:tcPr>
             <w:tcW w:type="dxa" w:w="3933"/>
-            <w:tcW w:type="dxa" w:w="3933"/>
-          </w:tcPr>
+          </w:tcPr>
+          <w:tcPr/>
           <w:p>
             <w:pPr>
               <w:pStyle w:val="Compact"/>
@@ -2280,8 +2280,8 @@
         <w:tc>
           <w:tcPr>
             <w:tcW w:type="dxa" w:w="2934"/>
-            <w:tcW w:type="dxa" w:w="2934"/>
-          </w:tcPr>
+          </w:tcPr>
+          <w:tcPr/>
           <w:p>
             <w:pPr>
               <w:pStyle w:val="Compact"/>
@@ -2347,8 +2347,8 @@
         <w:tc>
           <w:tcPr>
             <w:tcW w:type="dxa" w:w="587"/>
-            <w:tcW w:type="dxa" w:w="587"/>
-          </w:tcPr>
+          </w:tcPr>
+          <w:tcPr/>
           <w:p>
             <w:pPr>
               <w:pStyle w:val="Compact"/>
@@ -2366,8 +2366,8 @@
         <w:tc>
           <w:tcPr>
             <w:tcW w:type="dxa" w:w="2412"/>
-            <w:tcW w:type="dxa" w:w="2412"/>
-          </w:tcPr>
+          </w:tcPr>
+          <w:tcPr/>
           <w:p>
             <w:pPr>
               <w:pStyle w:val="Compact"/>
@@ -2384,8 +2384,8 @@
         <w:tc>
           <w:tcPr>
             <w:tcW w:type="dxa" w:w="3933"/>
-            <w:tcW w:type="dxa" w:w="3933"/>
-          </w:tcPr>
+          </w:tcPr>
+          <w:tcPr/>
           <w:p>
             <w:pPr>
               <w:pStyle w:val="Compact"/>
@@ -2491,8 +2491,8 @@
         <w:tc>
           <w:tcPr>
             <w:tcW w:type="dxa" w:w="2934"/>
-            <w:tcW w:type="dxa" w:w="2934"/>
-          </w:tcPr>
+          </w:tcPr>
+          <w:tcPr/>
           <w:p>
             <w:pPr>
               <w:pStyle w:val="Compact"/>
@@ -2641,34 +2641,267 @@
       <w:pPr>
         <w:pStyle w:val="Heading2"/>
       </w:pPr>
-      <w:bookmarkStart w:id="23" w:name="_e9bd41977c0215f5922b81ae2631660c7abc5d1"/>
-      <w:r>
-        <w:t xml:space="preserve">Acceptance evidence and result</w:t>
+      <w:bookmarkStart w:id="23" w:name="_1ae0103555490b51255e8cbfa9cc3b73f0881b3"/>
+      <w:r>
+        <w:t xml:space="preserve">Contribution evidence</w:t>
       </w:r>
       <w:bookmarkEnd w:id="23"/>
     </w:p>
+    <w:tbl>
+      <w:tblPr>
+        <w:tblStyle w:val="Table"/>
+        <w:tblW w:type="dxa" w:w="9866"/>
+        <w:tblLayout w:type="fixed"/>
+        <w:tblLook w:firstRow="1" w:lastRow="0" w:firstColumn="0" w:lastColumn="0" w:noHBand="0" w:noVBand="0" w:val="0020"/>
+      </w:tblPr>
+      <w:tblGrid>
+        <w:gridCol w:w="587"/>
+        <w:gridCol w:w="2412"/>
+        <w:gridCol w:w="3933"/>
+        <w:gridCol w:w="2934"/>
+      </w:tblGrid>
+      <w:tr>
+        <w:trPr>
+          <w:cantSplit/>
+          <w:tblHeader w:val="on"/>
+        </w:trPr>
+        <w:tc>
+          <w:tcPr>
+            <w:tcW w:type="dxa" w:w="587"/>
+          </w:tcPr>
+          <w:tcPr/>
+          <w:p>
+            <w:pPr>
+              <w:pStyle w:val="Compact"/>
+            </w:pPr>
+            <w:r>
+              <w:rPr>
+                <w:sz w:val="15"/>
+                <w:szCs w:val="15"/>
+              </w:rPr>
+              <w:t xml:space="preserve">ID</w:t>
+            </w:r>
+          </w:p>
+        </w:tc>
+        <w:tc>
+          <w:tcPr>
+            <w:tcW w:type="dxa" w:w="2412"/>
+          </w:tcPr>
+          <w:tcPr/>
+          <w:p>
+            <w:pPr>
+              <w:pStyle w:val="Compact"/>
+            </w:pPr>
+            <w:r>
+              <w:rPr>
+                <w:sz w:val="15"/>
+                <w:szCs w:val="15"/>
+              </w:rPr>
+              <w:t xml:space="preserve">Artefact</w:t>
+            </w:r>
+          </w:p>
+        </w:tc>
+        <w:tc>
+          <w:tcPr>
+            <w:tcW w:type="dxa" w:w="3933"/>
+          </w:tcPr>
+          <w:tcPr/>
+          <w:p>
+            <w:pPr>
+              <w:pStyle w:val="Compact"/>
+            </w:pPr>
+            <w:r>
+              <w:rPr>
+                <w:sz w:val="15"/>
+                <w:szCs w:val="15"/>
+              </w:rPr>
+              <w:t xml:space="preserve">Repository path</w:t>
+            </w:r>
+          </w:p>
+        </w:tc>
+        <w:tc>
+          <w:tcPr>
+            <w:tcW w:type="dxa" w:w="2934"/>
+          </w:tcPr>
+          <w:tcPr/>
+          <w:p>
+            <w:pPr>
+              <w:pStyle w:val="Compact"/>
+            </w:pPr>
+            <w:r>
+              <w:rPr>
+                <w:sz w:val="15"/>
+                <w:szCs w:val="15"/>
+              </w:rPr>
+              <w:t xml:space="preserve">Format and status</w:t>
+            </w:r>
+          </w:p>
+        </w:tc>
+      </w:tr>
+      <w:tr>
+        <w:trPr>
+          <w:cantSplit/>
+        </w:trPr>
+        <w:tc>
+          <w:tcPr>
+            <w:tcW w:type="dxa" w:w="587"/>
+          </w:tcPr>
+          <w:tcPr/>
+          <w:p>
+            <w:pPr>
+              <w:pStyle w:val="Compact"/>
+            </w:pPr>
+            <w:r>
+              <w:rPr>
+                <w:sz w:val="15"/>
+                <w:szCs w:val="15"/>
+                <w:rStyle w:val="VerbatimChar"/>
+              </w:rPr>
+              <w:t xml:space="preserve">C-1</w:t>
+            </w:r>
+          </w:p>
+        </w:tc>
+        <w:tc>
+          <w:tcPr>
+            <w:tcW w:type="dxa" w:w="2412"/>
+          </w:tcPr>
+          <w:tcPr/>
+          <w:p>
+            <w:pPr>
+              <w:pStyle w:val="Compact"/>
+            </w:pPr>
+            <w:r>
+              <w:rPr>
+                <w:sz w:val="15"/>
+                <w:szCs w:val="15"/>
+              </w:rPr>
+              <w:t xml:space="preserve">Contribution matrix, 29 September 2026</w:t>
+            </w:r>
+          </w:p>
+        </w:tc>
+        <w:tc>
+          <w:tcPr>
+            <w:tcW w:type="dxa" w:w="3933"/>
+          </w:tcPr>
+          <w:tcPr/>
+          <w:p>
+            <w:pPr>
+              <w:pStyle w:val="Compact"/>
+            </w:pPr>
+            <w:r>
+              <w:rPr>
+                <w:sz w:val="15"/>
+                <w:szCs w:val="15"/>
+                <w:rStyle w:val="VerbatimChar"/>
+              </w:rPr>
+              <w:t xml:space="preserve">submissions/BPMEA/contribution matrix.docx</w:t>
+            </w:r>
+          </w:p>
+        </w:tc>
+        <w:tc>
+          <w:tcPr>
+            <w:tcW w:type="dxa" w:w="2934"/>
+          </w:tcPr>
+          <w:tcPr/>
+          <w:p>
+            <w:pPr>
+              <w:pStyle w:val="Compact"/>
+            </w:pPr>
+            <w:r>
+              <w:rPr>
+                <w:sz w:val="15"/>
+                <w:szCs w:val="15"/>
+                <w:rStyle w:val="VerbatimChar"/>
+              </w:rPr>
+              <w:t xml:space="preserve">.docx</w:t>
+            </w:r>
+            <w:r>
+              <w:rPr>
+                <w:sz w:val="15"/>
+                <w:szCs w:val="15"/>
+              </w:rPr>
+              <w:t xml:space="preserve">. A 29 September snapshot: the group's self-reported contribution percentages, and the acceptance-test plan attributed to Ruby. The current contribution record (</w:t>
+            </w:r>
+            <w:r>
+              <w:rPr>
+                <w:sz w:val="15"/>
+                <w:szCs w:val="15"/>
+                <w:rStyle w:val="VerbatimChar"/>
+              </w:rPr>
+              <w:t xml:space="preserve">E-001</w:t>
+            </w:r>
+            <w:r>
+              <w:rPr>
+                <w:sz w:val="15"/>
+                <w:szCs w:val="15"/>
+              </w:rPr>
+              <w:t xml:space="preserve"> </w:t>
+            </w:r>
+            <w:r>
+              <w:rPr>
+                <w:sz w:val="15"/>
+                <w:szCs w:val="15"/>
+              </w:rPr>
+              <w:t xml:space="preserve">to</w:t>
+            </w:r>
+            <w:r>
+              <w:rPr>
+                <w:sz w:val="15"/>
+                <w:szCs w:val="15"/>
+              </w:rPr>
+              <w:t xml:space="preserve"> </w:t>
+            </w:r>
+            <w:r>
+              <w:rPr>
+                <w:sz w:val="15"/>
+                <w:szCs w:val="15"/>
+                <w:rStyle w:val="VerbatimChar"/>
+              </w:rPr>
+              <w:t xml:space="preserve">E-053</w:t>
+            </w:r>
+            <w:r>
+              <w:rPr>
+                <w:sz w:val="15"/>
+                <w:szCs w:val="15"/>
+              </w:rPr>
+              <w:t xml:space="preserve">) supersedes it; kept as evidence of that date, not as a current claim.</w:t>
+            </w:r>
+          </w:p>
+        </w:tc>
+      </w:tr>
+    </w:tbl>
     <w:p>
       <w:pPr>
-        <w:pStyle w:val="FirstParagraph"/>
-      </w:pPr>
-      <w:r>
-        <w:t xml:space="preserve">Master record:</w:t>
-      </w:r>
-      <w:r>
-        <w:t xml:space="preserve"> </w:t>
-      </w:r>
-      <w:r>
-        <w:rPr>
-          <w:rStyle w:val="VerbatimChar"/>
-        </w:rPr>
-        <w:t xml:space="preserve">Week3 Coursework/hospital-pathway/evidence/Camunda_V3_Acceptance_2026-10-19.txt</w:t>
-      </w:r>
-      <w:r>
-        <w:t xml:space="preserve">.</w:t>
-      </w:r>
+        <w:pStyle w:val="Heading2"/>
+      </w:pPr>
+      <w:bookmarkStart w:id="24" w:name="_e9bd41977c0215f5922b81ae2631660c7abc5d1"/>
+      <w:r>
+        <w:t xml:space="preserve">Acceptance evidence and result</w:t>
+      </w:r>
+      <w:bookmarkEnd w:id="24"/>
     </w:p>
     <w:p>
       <w:pPr>
+        <w:pStyle w:val="FirstParagraph"/>
+      </w:pPr>
+      <w:r>
+        <w:t xml:space="preserve">Master record:</w:t>
+      </w:r>
+      <w:r>
+        <w:t xml:space="preserve"> </w:t>
+      </w:r>
+      <w:r>
+        <w:rPr>
+          <w:rStyle w:val="VerbatimChar"/>
+        </w:rPr>
+        <w:t xml:space="preserve">Week3 Coursework/hospital-pathway/evidence/Camunda_V3_Acceptance_2026-10-19.txt</w:t>
+      </w:r>
+      <w:r>
+        <w:t xml:space="preserve">.</w:t>
+      </w:r>
+    </w:p>
+    <w:p>
+      <w:pPr>
         <w:pStyle w:val="BodyText"/>
       </w:pPr>
       <w:r>
@@ -2815,11 +3048,11 @@
       <w:pPr>
         <w:pStyle w:val="Heading2"/>
       </w:pPr>
-      <w:bookmarkStart w:id="24" w:name="_5553b545fb1dbec9d68ce31b1e2b1290ef99a44"/>
+      <w:bookmarkStart w:id="25" w:name="_5553b545fb1dbec9d68ce31b1e2b1290ef99a44"/>
       <w:r>
         <w:t xml:space="preserve">Run instructions</w:t>
       </w:r>
-      <w:bookmarkEnd w:id="24"/>
+      <w:bookmarkEnd w:id="25"/>
     </w:p>
     <w:p>
       <w:pPr>
@@ -3132,11 +3365,11 @@
       <w:pPr>
         <w:pStyle w:val="Heading2"/>
       </w:pPr>
-      <w:bookmarkStart w:id="25" w:name="_fb89ff908bbf18dd403d5a13878e12364a6f5f8"/>
+      <w:bookmarkStart w:id="26" w:name="_fb89ff908bbf18dd403d5a13878e12364a6f5f8"/>
       <w:r>
         <w:t xml:space="preserve">Limits recorded, not hidden</w:t>
       </w:r>
-      <w:bookmarkEnd w:id="25"/>
+      <w:bookmarkEnd w:id="26"/>
     </w:p>
     <w:p>
       <w:pPr>

</xml_diff>

<commit_message>
Update Submission Index and add second release of Group Project and Test Plan
The Submission Index has been revised to include the latest artefacts, specifically the addition of A-3, A-4, and B-8, reflecting the current state of the project as of 20 October 2026. The Group Project and Test Plan for BPM&EA has been introduced as a new document, replacing the previous version and detailing the project's scope, shared artefacts, and acceptance evidence. This update ensures all deliverables are accurately documented and accessible in both PDF and Word formats.
</commit_message>
<xml_diff>
--- a/submissions/Submission_Index.docx
+++ b/submissions/Submission_Index.docx
@@ -44,14 +44,10 @@
         <w:t xml:space="preserve">A-3</w:t>
       </w:r>
       <w:r>
-        <w:t xml:space="preserve"> </w:t>
-      </w:r>
-      <w:r>
-        <w:t xml:space="preserve">and</w:t>
-      </w:r>
-      <w:r>
-        <w:t xml:space="preserve"> </w:t>
-      </w:r>
+        <w:t xml:space="preserve">, </w:t>
+      </w:r>
+      <w:r/>
+      <w:r/>
       <w:r>
         <w:rPr>
           <w:rStyle w:val="VerbatimChar"/>
@@ -59,7 +55,7 @@
         <w:t xml:space="preserve">A-4</w:t>
       </w:r>
       <w:r>
-        <w:t xml:space="preserve"> </w:t>
+        <w:t xml:space="preserve"> and B-8 </w:t>
       </w:r>
       <w:r>
         <w:t xml:space="preserve">added 20 October 2026 · describes the revised release, tagged</w:t>
@@ -408,7 +404,34 @@
         <w:t xml:space="preserve">BPMEA_Strategic_Process_Readable_2026-10-19.pdf</w:t>
       </w:r>
       <w:r>
-        <w:t xml:space="preserve">; 29 September baseline</w:t>
+        <w:t xml:space="preserve">; </w:t>
+      </w:r>
+      <w:r>
+        <w:rPr>
+          <w:rStyle w:val="VerbatimChar"/>
+        </w:rPr>
+        <w:t>B-8</w:t>
+      </w:r>
+      <w:r>
+        <w:t xml:space="preserve"> </w:t>
+      </w:r>
+      <w:r>
+        <w:rPr>
+          <w:rStyle w:val="VerbatimChar"/>
+        </w:rPr>
+        <w:t>Group_Project_and_Test_Plan_2026-10-20.pdf</w:t>
+      </w:r>
+      <w:r>
+        <w:t xml:space="preserve"> + </w:t>
+      </w:r>
+      <w:r>
+        <w:rPr>
+          <w:rStyle w:val="VerbatimChar"/>
+        </w:rPr>
+        <w:t>.docx</w:t>
+      </w:r>
+      <w:r>
+        <w:t>; 29 September baseline</w:t>
       </w:r>
       <w:r>
         <w:t xml:space="preserve"> </w:t>
@@ -1293,7 +1316,7 @@
                 <w:sz w:val="15"/>
                 <w:szCs w:val="15"/>
               </w:rPr>
-              <w:t xml:space="preserve">PDF, 11 pages. In place. Twelve rows, one point each: seven peer points and five from the group's own review;</w:t>
+              <w:t>PDF, 11 pages. In place. Twelve rows: seven peer points and five from the group's own review;</w:t>
             </w:r>
             <w:r>
               <w:rPr>
@@ -1322,7 +1345,7 @@
                 <w:sz w:val="15"/>
                 <w:szCs w:val="15"/>
               </w:rPr>
-              <w:t xml:space="preserve">kept apart as not implemented, with its residual risk; tutor rows blank, as no tutor point was received in writing.</w:t>
+              <w:t>kept apart as not implemented, with its residual risk; tutor rows blank.</w:t>
             </w:r>
           </w:p>
         </w:tc>
@@ -1430,7 +1453,7 @@
                 <w:sz w:val="15"/>
                 <w:szCs w:val="15"/>
               </w:rPr>
-              <w:t xml:space="preserve">PDF, 7 pages. In place. Timeline of both releases; the plan for each, including the 19 October move to</w:t>
+              <w:t>PDF, 7 pages. In place. Timeline and plan for both releases, including the 19 October move to</w:t>
             </w:r>
             <w:r>
               <w:rPr>
@@ -1452,7 +1475,7 @@
                 <w:sz w:val="15"/>
                 <w:szCs w:val="15"/>
               </w:rPr>
-              <w:t xml:space="preserve">; task and standup records; the sprint review record from SR1 to SR4,</w:t>
+              <w:t>; task and standup records; SR1 to SR4 reviews,</w:t>
             </w:r>
             <w:r>
               <w:rPr>
@@ -1474,14 +1497,13 @@
                 <w:sz w:val="15"/>
                 <w:szCs w:val="15"/>
               </w:rPr>
-              <w:t xml:space="preserve"> </w:t>
-            </w:r>
-            <w:r>
-              <w:rPr>
-                <w:sz w:val="15"/>
-                <w:szCs w:val="15"/>
-              </w:rPr>
-              <w:t xml:space="preserve">shown as not held; a risk register for each release; lessons learned.</w:t>
+              <w:t xml:space="preserve"> not held; a risk register for each release; lessons learned.</w:t>
+            </w:r>
+            <w:r>
+              <w:rPr>
+                <w:sz w:val="15"/>
+                <w:szCs w:val="15"/>
+              </w:rPr>
             </w:r>
           </w:p>
         </w:tc>
@@ -2522,6 +2544,86 @@
           </w:p>
         </w:tc>
       </w:tr>
+      <w:tr>
+        <w:trPr>
+          <w:cantSplit/>
+        </w:trPr>
+        <w:tc>
+          <w:tcPr>
+            <w:tcW w:type="dxa" w:w="587"/>
+          </w:tcPr>
+          <w:tcPr/>
+          <w:p>
+            <w:pPr>
+              <w:pStyle w:val="Compact"/>
+            </w:pPr>
+            <w:r>
+              <w:rPr>
+                <w:sz w:val="15"/>
+                <w:szCs w:val="15"/>
+                <w:rStyle w:val="VerbatimChar"/>
+              </w:rPr>
+              <w:t>B-8</w:t>
+            </w:r>
+          </w:p>
+        </w:tc>
+        <w:tc>
+          <w:tcPr>
+            <w:tcW w:type="dxa" w:w="2412"/>
+          </w:tcPr>
+          <w:tcPr/>
+          <w:p>
+            <w:pPr>
+              <w:pStyle w:val="Compact"/>
+            </w:pPr>
+            <w:r>
+              <w:rPr>
+                <w:sz w:val="15"/>
+                <w:szCs w:val="15"/>
+              </w:rPr>
+              <w:t>Group project and test plan, second release</w:t>
+            </w:r>
+          </w:p>
+        </w:tc>
+        <w:tc>
+          <w:tcPr>
+            <w:tcW w:type="dxa" w:w="3933"/>
+          </w:tcPr>
+          <w:tcPr/>
+          <w:p>
+            <w:pPr>
+              <w:pStyle w:val="Compact"/>
+            </w:pPr>
+            <w:r>
+              <w:rPr>
+                <w:sz w:val="15"/>
+                <w:szCs w:val="15"/>
+                <w:rStyle w:val="VerbatimChar"/>
+              </w:rPr>
+              <w:t>submissions/BPMEA/Group_Project_and_Test_Plan_2026-10-20.pdf and .docx</w:t>
+            </w:r>
+          </w:p>
+        </w:tc>
+        <w:tc>
+          <w:tcPr>
+            <w:tcW w:type="dxa" w:w="2934"/>
+          </w:tcPr>
+          <w:tcPr/>
+          <w:p>
+            <w:pPr>
+              <w:pStyle w:val="Compact"/>
+            </w:pPr>
+            <w:r>
+              <w:rPr>
+                <w:sz w:val="15"/>
+                <w:szCs w:val="15"/>
+                <w:rStyle w:val="VerbatimChar"/>
+              </w:rPr>
+              <w:t>PDF, 9 pages. In place. Six acceptance cases with instance keys; AT-03 FAIL; criteria no case drove are marked NOT EXECUTED.</w:t>
+            </w:r>
+          </w:p>
+        </w:tc>
+      </w:tr>
     </w:tbl>
     <w:p>
       <w:pPr>
@@ -2603,38 +2705,10 @@
         <w:rPr>
           <w:rStyle w:val="VerbatimChar"/>
         </w:rPr>
-        <w:t xml:space="preserve">B-8</w:t>
-      </w:r>
-      <w:r>
-        <w:t xml:space="preserve">, the second-release Project and Test Plan, is</w:t>
-      </w:r>
-      <w:r>
-        <w:t xml:space="preserve"> </w:t>
-      </w:r>
-      <w:r>
-        <w:rPr>
-          <w:b/>
-          <w:bCs/>
-        </w:rPr>
-        <w:t xml:space="preserve">not in place</w:t>
-      </w:r>
-      <w:r>
-        <w:t xml:space="preserve">: only</w:t>
-      </w:r>
-      <w:r>
-        <w:t xml:space="preserve"> </w:t>
-      </w:r>
-      <w:r>
-        <w:rPr>
-          <w:rStyle w:val="VerbatimChar"/>
-        </w:rPr>
-        <w:t xml:space="preserve">submissions/BPMEA/Group_Project_and_Test_Plan_2026-09-29.pdf</w:t>
-      </w:r>
-      <w:r>
-        <w:t xml:space="preserve"> </w:t>
-      </w:r>
-      <w:r>
-        <w:t xml:space="preserve">exists.</w:t>
+        <w:t>B-8</w:t>
+      </w:r>
+      <w:r>
+        <w:t xml:space="preserve"> is listed in the table above; the 29 September plan is kept beside it.</w:t>
       </w:r>
     </w:p>
     <w:p>
@@ -3007,11 +3081,9 @@
         </w:rPr>
         <w:t xml:space="preserve">fails</w:t>
       </w:r>
-      <w:r>
-        <w:t xml:space="preserve"> </w:t>
-      </w:r>
-      <w:r>
-        <w:t xml:space="preserve">because the model has no candidate groups, so a Medical Secretary can still complete the Consultant decision. A clean</w:t>
+      <w:r/>
+      <w:r>
+        <w:t>: no candidate groups exist, so a Medical Secretary can still complete the Consultant decision. A clean</w:t>
       </w:r>
       <w:r>
         <w:t xml:space="preserve"> </w:t>
@@ -3041,7 +3113,7 @@
         <w:t xml:space="preserve"> </w:t>
       </w:r>
       <w:r>
-        <w:t xml:space="preserve">the bundled Connectors health check shut c8run down mid-run; the cases were re-run after the restart.</w:t>
+        <w:t>the Connectors health check shut c8run down mid-run; the cases were re-run after the restart.</w:t>
       </w:r>
     </w:p>
     <w:p>
@@ -3438,27 +3510,6 @@
       </w:r>
       <w:r>
         <w:t xml:space="preserve">i* SD/SR second-owner review is unsigned.</w:t>
-      </w:r>
-    </w:p>
-    <w:p>
-      <w:pPr>
-        <w:pStyle w:val="Compact"/>
-        <w:numPr>
-          <w:ilvl w:val="0"/>
-          <w:numId w:val="1003"/>
-        </w:numPr>
-      </w:pPr>
-      <w:r>
-        <w:rPr>
-          <w:rStyle w:val="VerbatimChar"/>
-        </w:rPr>
-        <w:t xml:space="preserve">B-8</w:t>
-      </w:r>
-      <w:r>
-        <w:t xml:space="preserve"> </w:t>
-      </w:r>
-      <w:r>
-        <w:t xml:space="preserve">does not exist in second-release form.</w:t>
       </w:r>
     </w:p>
     <w:p>

</xml_diff>

<commit_message>
Leave the four unowned worker files unmarked rather than reviewed
Naming a reviewer against a file with no recorded author asserts an independence
the group cannot show. The four are now marked "not marked" and are not counted
towards B-6, so the record states 13 of 17 files reviewed instead of claiming
the whole module.

The Definition of Done line and the index follow the same count, and the note
now says why: the files exist and the build compiles them, what is missing is
the record of who wrote them, and no author was reconstructed to make the
review look complete.
</commit_message>
<xml_diff>
--- a/submissions/Submission_Index.docx
+++ b/submissions/Submission_Index.docx
@@ -3562,7 +3562,7 @@
           <w:rStyle w:val="VerbatimChar"/>
           <w:sz w:val="18"/>
         </w:rPr>
-        <w:t>B-6: reviewed 20 October 2026; four files have no recorded author.</w:t>
+        <w:t>B-6: 13 of 17 files reviewed 20 October 2026; four with no recorded author are left unmarked.</w:t>
       </w:r>
       <w:r>
         <w:rPr>
@@ -3619,7 +3619,7 @@
         <w:spacing w:before="0" w:after="0"/>
       </w:pPr>
       <w:r>
-        <w:t>The contribution record holds E-001 to E-053 and carries Ender's review of 20 October; the Definition of Done carries a four-member sign-off of the same date, with three of its 31 items left unticked and the reason stated.</w:t>
+        <w:t>The contribution record (E-001 to E-053, Ender's review) and the Definition of Done (four-member sign-off, 28 of 31 ticked) are both dated 20 October.</w:t>
       </w:r>
       <w:r/>
       <w:r>

</xml_diff>

<commit_message>
Stop the packs from saying the Admin correction was not applied
The Submission Index, the root README, the PB-16 backlog row and the contribution record all still described the nine Admin contribution links as recorded but not applied. They were applied. Each now names what was corrected and what is still open: the Finance SR labels and the Admin figure, which has not been re-exported.

The Definition of Done, PB-13, PB-16, PB-30 and PB-31 sign-offs were recorded earlier the same day; the personal todo and the review checklist still called them unsigned and are corrected here. The index stays at 2 pages.
</commit_message>
<xml_diff>
--- a/submissions/Submission_Index.docx
+++ b/submissions/Submission_Index.docx
@@ -2031,7 +2031,7 @@
                 <w:sz w:val="15"/>
                 <w:szCs w:val="15"/>
               </w:rPr>
-              <w:t>piStar .txt + PNG, four models and four figures. Ryan reviewed 20 October 2026 and accepted the figures as delivered; his corrections are recorded and not applied (section 12 of the model notes).</w:t>
+              <w:t>piStar .txt + PNG, four models and four figures. Ryan reviewed 20 October 2026; nine Admin links since corrected, Finance labels not, Admin PNG not re-exported (section 12.2).</w:t>
             </w:r>
             <w:r>
               <w:rPr>
@@ -3487,7 +3487,7 @@
           <w:rStyle w:val="VerbatimChar"/>
           <w:sz w:val="18"/>
         </w:rPr>
-        <w:t>PB-16: Ryan reviewed 20 October 2026; corrections recorded and not applied.</w:t>
+        <w:t>PB-16: reviewed 20 October; nine Admin links corrected, Finance labels open.</w:t>
       </w:r>
       <w:r>
         <w:rPr>

</xml_diff>

<commit_message>
Answer the Finance SR review point instead of leaving it open
Section 11 asked for the Finance SR labels to be aligned with the SD. Checked against the dependency catalogue, none of the four is a metamodel defect: D18 is a documented service-view slice of a clinical softgoal, D17 restores a dependency the SD diagram omits, and D14 to D16 keep the catalogue's depender, dependee and direction. All 28 links resolve and all four contribution links target a quality, so the figure still matches its source and needs no re-export.

Section 12.2 now records that finding in place of the earlier claim that D14 to D17 differ from the SD, which could not apply to D17 because the SD does not draw it. The index, README, backlog row, plan and personal todo follow.
</commit_message>
<xml_diff>
--- a/submissions/Submission_Index.docx
+++ b/submissions/Submission_Index.docx
@@ -2031,7 +2031,7 @@
                 <w:sz w:val="15"/>
                 <w:szCs w:val="15"/>
               </w:rPr>
-              <w:t>piStar .txt + PNG, four models and four figures. Ryan reviewed 20 October 2026; nine Admin links since corrected, Finance labels not, Admin PNG not re-exported (section 12.2).</w:t>
+              <w:t>piStar .txt + PNG, four models and four figures. Ryan reviewed 20 October 2026; nine Admin links corrected, Finance labels left as drawn, Admin PNG open (section 12.2).</w:t>
             </w:r>
             <w:r>
               <w:rPr>
@@ -3487,7 +3487,7 @@
           <w:rStyle w:val="VerbatimChar"/>
           <w:sz w:val="18"/>
         </w:rPr>
-        <w:t>PB-16: reviewed 20 October; nine Admin links corrected, Finance labels open.</w:t>
+        <w:t>PB-16: reviewed 20 October; Admin links and Finance labels settled; Admin PNG open.</w:t>
       </w:r>
       <w:r>
         <w:rPr>

</xml_diff>

<commit_message>
Record the Admin SR figure as re-exported, and reconcile the i* checklist
The figure was regenerated from the corrected source at 19:34 (312d90b), so
five places that still said it had not been re-exported are corrected: the i*
notes section 12.1, the root README, the backlog evidence cell for PB-16, the
personal todo, the submission index and the group plan. Both PDFs are
re-exported; the index still holds two pages.

Section 10 of the i* notes is reconciled with section 12: four of its five
items are certified against the selected piStar models and one is left
uncertified, the D1-D24 coverage claim, which the views do not make.

The personal todo also carried two stale entries: PB-31's sign-off was recorded
as outstanding in one sentence and as recorded in the next, and the merged
model's deployability was still open although the 19 October run answers it.
</commit_message>
<xml_diff>
--- a/submissions/Submission_Index.docx
+++ b/submissions/Submission_Index.docx
@@ -2016,7 +2016,7 @@
                 <w:sz w:val="15"/>
                 <w:szCs w:val="15"/>
               </w:rPr>
-              <w:t>piStar .txt + PNG, four models and four figures. Ryan reviewed 20 October 2026; nine Admin links corrected, Finance labels left as drawn, Admin PNG open (section 12.2).</w:t>
+              <w:t>piStar .txt + PNG, four models and four figures. Ryan reviewed 20 October 2026; nine Admin links corrected and figure re-exported, Finance labels left as drawn (section 12.2).</w:t>
             </w:r>
             <w:r>
               <w:rPr>
@@ -3472,7 +3472,7 @@
           <w:rStyle w:val="VerbatimChar"/>
           <w:sz w:val="18"/>
         </w:rPr>
-        <w:t>PB-16: reviewed 20 October; Admin links and Finance labels settled; Admin PNG open.</w:t>
+        <w:t>PB-16: reviewed 20 October; Admin links, Finance labels and figure all settled.</w:t>
       </w:r>
       <w:r>
         <w:rPr>

</xml_diff>

<commit_message>
docs(submission): state PB-16's uncertified checklist item among the limits / 把 PB-16 未认证的清单项写进限制一节
</commit_message>
<xml_diff>
--- a/submissions/Submission_Index.docx
+++ b/submissions/Submission_Index.docx
@@ -3472,7 +3472,7 @@
           <w:rStyle w:val="VerbatimChar"/>
           <w:sz w:val="18"/>
         </w:rPr>
-        <w:t>PB-16: reviewed 20 October; Admin links, Finance labels and figure all settled.</w:t>
+        <w:t>PB-16: reviewed 20 October; Admin links, Finance labels and figure settled. Checklist item 2 stays uncertified: the views cover 16 of the 24 dependencies.</w:t>
       </w:r>
       <w:r>
         <w:rPr>
@@ -3604,7 +3604,7 @@
         <w:spacing w:before="0" w:after="0"/>
       </w:pPr>
       <w:r>
-        <w:t>The contribution record (E-001 to E-053, Ender's review) and the Definition of Done (four-member sign-off, 28 of 31 ticked) are both dated 20 October.</w:t>
+        <w:t>The contribution record (E-001 to E-053, Ender's review) and the Definition of Done (four signatures, 28 of 31 ticked) are dated 20 October.</w:t>
       </w:r>
       <w:r/>
       <w:r>

</xml_diff>